<commit_message>
Quita el aviso de la IA del PDF de -AZO intensificador (1/4)
Elimina el bloque "Aviso importante" sobre las posibles equivocaciones
de la IA, a petición de Mercedes. Verificado: sigue en 4 páginas, sin
glifos rotos, maquetación limpia sin hueco ni caja vacía.

Co-Authored-By: Claude Sonnet 5 <noreply@anthropic.com>
</commit_message>
<xml_diff>
--- a/DESCARGABLES_PDF/AZO_INTENSIFICADOR/AZO_INTENSIFICADOR_DESCARGABLE.docx
+++ b/DESCARGABLES_PDF/AZO_INTENSIFICADOR/AZO_INTENSIFICADOR_DESCARGABLE.docx
@@ -6081,81 +6081,6 @@
         <w:t xml:space="preserve"/>
       </w:r>
     </w:p>
-    <w:tbl>
-      <w:tblPr>
-        <w:tblW w:type="dxa" w:w="9868"/>
-        <w:tblBorders>
-          <w:top w:val="single" w:color="auto" w:sz="4"/>
-          <w:left w:val="single" w:color="auto" w:sz="4"/>
-          <w:bottom w:val="single" w:color="auto" w:sz="4"/>
-          <w:right w:val="single" w:color="auto" w:sz="4"/>
-          <w:insideH w:val="single" w:color="auto" w:sz="4"/>
-          <w:insideV w:val="single" w:color="auto" w:sz="4"/>
-        </w:tblBorders>
-      </w:tblPr>
-      <w:tblGrid>
-        <w:gridCol w:w="9868"/>
-      </w:tblGrid>
-      <w:tr>
-        <w:tc>
-          <w:tcPr>
-            <w:tcW w:type="dxa" w:w="9868"/>
-            <w:tcBorders>
-              <w:top w:val="nil" w:color="auto" w:sz="0"/>
-              <w:left w:val="single" w:color="7B1D1D" w:sz="18"/>
-              <w:bottom w:val="nil" w:color="auto" w:sz="0"/>
-              <w:right w:val="nil" w:color="auto" w:sz="0"/>
-            </w:tcBorders>
-            <w:shd w:fill="F5F0E5" w:color="auto" w:val="clear"/>
-            <w:tcMar>
-              <w:top w:type="dxa" w:w="125"/>
-              <w:left w:type="dxa" w:w="240"/>
-              <w:bottom w:type="dxa" w:w="125"/>
-              <w:right w:type="dxa" w:w="240"/>
-            </w:tcMar>
-            <w:vAlign w:val="center"/>
-          </w:tcPr>
-          <w:p>
-            <w:pPr>
-              <w:spacing w:after="90" w:before="0"/>
-              <w:jc w:val="left"/>
-            </w:pPr>
-            <w:r>
-              <w:rPr>
-                <w:rFonts w:ascii="Arial" w:cs="Arial" w:eastAsia="Arial" w:hAnsi="Arial"/>
-                <w:b/>
-                <w:bCs/>
-                <w:i w:val="false"/>
-                <w:iCs w:val="false"/>
-                <w:color w:val="1B2A4B"/>
-                <w:sz w:val="20"/>
-                <w:szCs w:val="20"/>
-              </w:rPr>
-              <w:t xml:space="preserve">Aviso importante</w:t>
-            </w:r>
-          </w:p>
-          <w:p>
-            <w:pPr>
-              <w:spacing w:after="0" w:before="0"/>
-              <w:jc w:val="left"/>
-            </w:pPr>
-            <w:r>
-              <w:rPr>
-                <w:rFonts w:ascii="Arial" w:cs="Arial" w:eastAsia="Arial" w:hAnsi="Arial"/>
-                <w:b w:val="false"/>
-                <w:bCs w:val="false"/>
-                <w:i w:val="false"/>
-                <w:iCs w:val="false"/>
-                <w:color w:val="2C2C2C"/>
-                <w:sz w:val="19"/>
-                <w:szCs w:val="19"/>
-              </w:rPr>
-              <w:t xml:space="preserve">La IA a veces comete errores, sobre todo con vocabulario coloquial y regional: puede aceptar palabras con -AZO que ningún hispanohablante usaría. Si una corrección no te convence o contradice lo que aprendiste aquí, pregunta a tu profesora. La IA es un gimnasio: te deja entrenar mil veces al día. El profesor es el entrenador: te dice qué ejercicios te están haciendo avanzar de verdad.</w:t>
-            </w:r>
-          </w:p>
-        </w:tc>
-      </w:tr>
-    </w:tbl>
     <w:p>
       <w:pPr>
         <w:spacing w:after="160"/>

</xml_diff>